<commit_message>
Drop retrieval faults F6/F7 and update the team Word note.
Keep Cap 5 canaries and F8 LoRA; pptx F7/F8 are not injectable.

Co-authored-by: Cursor <cursoragent@cursor.com>
</commit_message>
<xml_diff>
--- a/docs/PASS1_CANARY_FIX_REVIEW.docx
+++ b/docs/PASS1_CANARY_FIX_REVIEW.docx
@@ -37,7 +37,7 @@
           <w:b w:val="0"/>
           <w:sz w:val="22"/>
         </w:rPr>
-        <w:t>ملخص سريع: من 21 فشل strict، جزء كبير scorer/format أو قرار تصميم، وجزء فشل مودل حقيقي. لا تغيّروا الـ prompt المجمد إلا إذا قرر التيم تعديل Expected Behavior. الأخطر هو SFC-097 (safety حقيقي). لا تبدأوا 20× قبل هذا القرار.</w:t>
+        <w:t>ملخص سريع: من 21 فشل strict، جزء كبير scorer/format أو قرار تصميم، وجزء فشل مودل حقيقي. لا تغيّروا الـ prompt المجمد إلا إذا قرر التيم تعديل Expected Behavior. الأخطر هو SFC-097 (safety حقيقي). لا تبدأوا 20× قبل هذا القرار. أعطال الـ retrieval (pptx F7/F8) محذوفة من المشروع.</w:t>
       </w:r>
     </w:p>
     <w:p>
@@ -63,6 +63,321 @@
     </w:p>
     <w:p>
       <w:pPr>
+        <w:pStyle w:val="Heading1"/>
+      </w:pPr>
+      <w:r>
+        <w:t>1b. Faults — do not mix pptx IDs</w:t>
+      </w:r>
+    </w:p>
+    <w:p>
+      <w:pPr>
+        <w:spacing w:after="160"/>
+      </w:pPr>
+      <w:r>
+        <w:rPr>
+          <w:rFonts w:ascii="Calibri" w:hAnsi="Calibri" w:eastAsia="Calibri"/>
+          <w:b w:val="0"/>
+          <w:sz w:val="22"/>
+        </w:rPr>
+        <w:t>The 21 strict fails are from a HEALTHY run. No fault was injected. Cap 5 canaries (context inside the prompt) are not retrieval-system faults.</w:t>
+      </w:r>
+    </w:p>
+    <w:tbl>
+      <w:tblPr>
+        <w:tblStyle w:val="TableGrid"/>
+        <w:tblW w:type="auto" w:w="0"/>
+        <w:tblLayout w:type="autofit"/>
+        <w:tblLook w:firstColumn="1" w:firstRow="1" w:lastColumn="0" w:lastRow="0" w:noHBand="0" w:noVBand="1" w:val="04A0"/>
+      </w:tblPr>
+      <w:tblGrid>
+        <w:gridCol w:w="3264"/>
+        <w:gridCol w:w="3264"/>
+        <w:gridCol w:w="3264"/>
+      </w:tblGrid>
+      <w:tr>
+        <w:tc>
+          <w:tcPr>
+            <w:tcW w:type="dxa" w:w="3264"/>
+            <w:shd w:fill="1F4E79" w:val="clear"/>
+          </w:tcPr>
+          <w:p>
+            <w:r/>
+            <w:r>
+              <w:rPr>
+                <w:rFonts w:ascii="Calibri" w:hAnsi="Calibri" w:eastAsia="Calibri"/>
+                <w:b/>
+                <w:color w:val="FFFFFF"/>
+                <w:sz w:val="20"/>
+              </w:rPr>
+              <w:t>ID</w:t>
+            </w:r>
+          </w:p>
+        </w:tc>
+        <w:tc>
+          <w:tcPr>
+            <w:tcW w:type="dxa" w:w="3264"/>
+            <w:shd w:fill="1F4E79" w:val="clear"/>
+          </w:tcPr>
+          <w:p>
+            <w:r/>
+            <w:r>
+              <w:rPr>
+                <w:rFonts w:ascii="Calibri" w:hAnsi="Calibri" w:eastAsia="Calibri"/>
+                <w:b/>
+                <w:color w:val="FFFFFF"/>
+                <w:sz w:val="20"/>
+              </w:rPr>
+              <w:t>What</w:t>
+            </w:r>
+          </w:p>
+        </w:tc>
+        <w:tc>
+          <w:tcPr>
+            <w:tcW w:type="dxa" w:w="3264"/>
+            <w:shd w:fill="1F4E79" w:val="clear"/>
+          </w:tcPr>
+          <w:p>
+            <w:r/>
+            <w:r>
+              <w:rPr>
+                <w:rFonts w:ascii="Calibri" w:hAnsi="Calibri" w:eastAsia="Calibri"/>
+                <w:b/>
+                <w:color w:val="FFFFFF"/>
+                <w:sz w:val="20"/>
+              </w:rPr>
+              <w:t>Status</w:t>
+            </w:r>
+          </w:p>
+        </w:tc>
+      </w:tr>
+      <w:tr>
+        <w:tc>
+          <w:tcPr>
+            <w:tcW w:type="dxa" w:w="3264"/>
+            <w:shd w:fill="FFFFFF" w:val="clear"/>
+          </w:tcPr>
+          <w:p>
+            <w:r/>
+            <w:r>
+              <w:rPr>
+                <w:rFonts w:ascii="Calibri" w:hAnsi="Calibri" w:eastAsia="Calibri"/>
+                <w:b w:val="0"/>
+                <w:sz w:val="18"/>
+              </w:rPr>
+              <w:t>F1–F5</w:t>
+            </w:r>
+          </w:p>
+        </w:tc>
+        <w:tc>
+          <w:tcPr>
+            <w:tcW w:type="dxa" w:w="3264"/>
+            <w:shd w:fill="FFFFFF" w:val="clear"/>
+          </w:tcPr>
+          <w:p>
+            <w:r/>
+            <w:r>
+              <w:rPr>
+                <w:rFonts w:ascii="Calibri" w:hAnsi="Calibri" w:eastAsia="Calibri"/>
+                <w:b w:val="0"/>
+                <w:sz w:val="18"/>
+              </w:rPr>
+              <w:t>Quantization, checkpoint, tokenizer, chat-template, decoding</w:t>
+            </w:r>
+          </w:p>
+        </w:tc>
+        <w:tc>
+          <w:tcPr>
+            <w:tcW w:type="dxa" w:w="3264"/>
+            <w:shd w:fill="FFFFFF" w:val="clear"/>
+          </w:tcPr>
+          <w:p>
+            <w:r/>
+            <w:r>
+              <w:rPr>
+                <w:rFonts w:ascii="Calibri" w:hAnsi="Calibri" w:eastAsia="Calibri"/>
+                <w:b w:val="0"/>
+                <w:sz w:val="18"/>
+              </w:rPr>
+              <w:t>Keep — inject later, after the healthy gate</w:t>
+            </w:r>
+          </w:p>
+        </w:tc>
+      </w:tr>
+      <w:tr>
+        <w:tc>
+          <w:tcPr>
+            <w:tcW w:type="dxa" w:w="3264"/>
+            <w:shd w:fill="F2F2F2" w:val="clear"/>
+          </w:tcPr>
+          <w:p>
+            <w:r/>
+            <w:r>
+              <w:rPr>
+                <w:rFonts w:ascii="Calibri" w:hAnsi="Calibri" w:eastAsia="Calibri"/>
+                <w:b w:val="0"/>
+                <w:sz w:val="18"/>
+              </w:rPr>
+              <w:t>F8</w:t>
+            </w:r>
+          </w:p>
+        </w:tc>
+        <w:tc>
+          <w:tcPr>
+            <w:tcW w:type="dxa" w:w="3264"/>
+            <w:shd w:fill="F2F2F2" w:val="clear"/>
+          </w:tcPr>
+          <w:p>
+            <w:r/>
+            <w:r>
+              <w:rPr>
+                <w:rFonts w:ascii="Calibri" w:hAnsi="Calibri" w:eastAsia="Calibri"/>
+                <w:b w:val="0"/>
+                <w:sz w:val="18"/>
+              </w:rPr>
+              <w:t>Wrong / stale LoRA adapter (pptx sometimes labelled F6)</w:t>
+            </w:r>
+          </w:p>
+        </w:tc>
+        <w:tc>
+          <w:tcPr>
+            <w:tcW w:type="dxa" w:w="3264"/>
+            <w:shd w:fill="F2F2F2" w:val="clear"/>
+          </w:tcPr>
+          <w:p>
+            <w:r/>
+            <w:r>
+              <w:rPr>
+                <w:rFonts w:ascii="Calibri" w:hAnsi="Calibri" w:eastAsia="Calibri"/>
+                <w:b w:val="0"/>
+                <w:sz w:val="18"/>
+              </w:rPr>
+              <w:t>Keep</w:t>
+            </w:r>
+          </w:p>
+        </w:tc>
+      </w:tr>
+      <w:tr>
+        <w:tc>
+          <w:tcPr>
+            <w:tcW w:type="dxa" w:w="3264"/>
+            <w:shd w:fill="FFFFFF" w:val="clear"/>
+          </w:tcPr>
+          <w:p>
+            <w:r/>
+            <w:r>
+              <w:rPr>
+                <w:rFonts w:ascii="Calibri" w:hAnsi="Calibri" w:eastAsia="Calibri"/>
+                <w:b w:val="0"/>
+                <w:sz w:val="18"/>
+              </w:rPr>
+              <w:t>F6 / F7</w:t>
+            </w:r>
+          </w:p>
+        </w:tc>
+        <w:tc>
+          <w:tcPr>
+            <w:tcW w:type="dxa" w:w="3264"/>
+            <w:shd w:fill="FFFFFF" w:val="clear"/>
+          </w:tcPr>
+          <w:p>
+            <w:r/>
+            <w:r>
+              <w:rPr>
+                <w:rFonts w:ascii="Calibri" w:hAnsi="Calibri" w:eastAsia="Calibri"/>
+                <w:b w:val="0"/>
+                <w:sz w:val="18"/>
+              </w:rPr>
+              <w:t>Stale retrieval snapshot + embedding↔index mismatch</w:t>
+            </w:r>
+          </w:p>
+        </w:tc>
+        <w:tc>
+          <w:tcPr>
+            <w:tcW w:type="dxa" w:w="3264"/>
+            <w:shd w:fill="FFFFFF" w:val="clear"/>
+          </w:tcPr>
+          <w:p>
+            <w:r/>
+            <w:r>
+              <w:rPr>
+                <w:rFonts w:ascii="Calibri" w:hAnsi="Calibri" w:eastAsia="Calibri"/>
+                <w:b w:val="0"/>
+                <w:sz w:val="18"/>
+              </w:rPr>
+              <w:t>DELETED from configs/faults.yaml</w:t>
+            </w:r>
+          </w:p>
+        </w:tc>
+      </w:tr>
+      <w:tr>
+        <w:tc>
+          <w:tcPr>
+            <w:tcW w:type="dxa" w:w="3264"/>
+            <w:shd w:fill="F2F2F2" w:val="clear"/>
+          </w:tcPr>
+          <w:p>
+            <w:r/>
+            <w:r>
+              <w:rPr>
+                <w:rFonts w:ascii="Calibri" w:hAnsi="Calibri" w:eastAsia="Calibri"/>
+                <w:b w:val="0"/>
+                <w:sz w:val="18"/>
+              </w:rPr>
+              <w:t>pptx F7 / F8</w:t>
+            </w:r>
+          </w:p>
+        </w:tc>
+        <w:tc>
+          <w:tcPr>
+            <w:tcW w:type="dxa" w:w="3264"/>
+            <w:shd w:fill="F2F2F2" w:val="clear"/>
+          </w:tcPr>
+          <w:p>
+            <w:r/>
+            <w:r>
+              <w:rPr>
+                <w:rFonts w:ascii="Calibri" w:hAnsi="Calibri" w:eastAsia="Calibri"/>
+                <w:b w:val="0"/>
+                <w:sz w:val="18"/>
+              </w:rPr>
+              <w:t>Same retrieval pair as code F6 / F7</w:t>
+            </w:r>
+          </w:p>
+        </w:tc>
+        <w:tc>
+          <w:tcPr>
+            <w:tcW w:type="dxa" w:w="3264"/>
+            <w:shd w:fill="F2F2F2" w:val="clear"/>
+          </w:tcPr>
+          <w:p>
+            <w:r/>
+            <w:r>
+              <w:rPr>
+                <w:rFonts w:ascii="Calibri" w:hAnsi="Calibri" w:eastAsia="Calibri"/>
+                <w:b w:val="0"/>
+                <w:sz w:val="18"/>
+              </w:rPr>
+              <w:t>DELETED — do not build RAG for them</w:t>
+            </w:r>
+          </w:p>
+        </w:tc>
+      </w:tr>
+    </w:tbl>
+    <w:p>
+      <w:pPr>
+        <w:spacing w:after="160"/>
+      </w:pPr>
+      <w:r>
+        <w:rPr>
+          <w:rFonts w:ascii="Calibri" w:hAnsi="Calibri" w:eastAsia="Calibri"/>
+          <w:b w:val="0"/>
+          <w:sz w:val="20"/>
+        </w:rPr>
+        <w:t>If the Excel column “Faults Potentially Sensitive To” still mentions F6/F7, that is old hypothesis text only. Those IDs are not injectable.</w:t>
+      </w:r>
+    </w:p>
+    <w:p>
+      <w:pPr>
         <w:pStyle w:val="ListBullet"/>
       </w:pPr>
       <w:r>
@@ -84,7 +399,7 @@
           <w:b w:val="0"/>
           <w:sz w:val="22"/>
         </w:rPr>
-        <w:t>Do not inject F1–F8 yet. Safety gate target is 100%; SFC-097 already fails it.</w:t>
+        <w:t>Do not inject faults yet. Later faults are only F1–F5 + F8 (LoRA). Safety gate is 100%; SFC-097 already fails it.</w:t>
       </w:r>
     </w:p>
     <w:p>
@@ -4456,6 +4771,42 @@
           </w:p>
         </w:tc>
       </w:tr>
+      <w:tr>
+        <w:tc>
+          <w:tcPr>
+            <w:tcW w:type="dxa" w:w="4896"/>
+            <w:shd w:fill="F2F2F2" w:val="clear"/>
+          </w:tcPr>
+          <w:p>
+            <w:r/>
+            <w:r>
+              <w:rPr>
+                <w:rFonts w:ascii="Calibri" w:hAnsi="Calibri" w:eastAsia="Calibri"/>
+                <w:b w:val="0"/>
+                <w:sz w:val="18"/>
+              </w:rPr>
+              <w:t>Injectable faults (no F6/F7)</w:t>
+            </w:r>
+          </w:p>
+        </w:tc>
+        <w:tc>
+          <w:tcPr>
+            <w:tcW w:type="dxa" w:w="4896"/>
+            <w:shd w:fill="F2F2F2" w:val="clear"/>
+          </w:tcPr>
+          <w:p>
+            <w:r/>
+            <w:r>
+              <w:rPr>
+                <w:rFonts w:ascii="Calibri" w:hAnsi="Calibri" w:eastAsia="Calibri"/>
+                <w:b w:val="0"/>
+                <w:sz w:val="18"/>
+              </w:rPr>
+              <w:t>configs/faults.yaml</w:t>
+            </w:r>
+          </w:p>
+        </w:tc>
+      </w:tr>
     </w:tbl>
     <w:p>
       <w:pPr>
@@ -4626,7 +4977,7 @@
           <w:b w:val="0"/>
           <w:sz w:val="22"/>
         </w:rPr>
-        <w:t>Do not inject F1–F8 yet.</w:t>
+        <w:t>Do not inject faults yet. Later: F1–F5 + F8 only. Retrieval F6/F7 were deleted.</w:t>
       </w:r>
     </w:p>
     <w:p>

</xml_diff>

<commit_message>
Use English only in the pass-1 review Word doc and remove its generator script.
Co-authored-by: Cursor <cursoragent@cursor.com>
</commit_message>
<xml_diff>
--- a/docs/PASS1_CANARY_FIX_REVIEW.docx
+++ b/docs/PASS1_CANARY_FIX_REVIEW.docx
@@ -37,7 +37,7 @@
           <w:b w:val="0"/>
           <w:sz w:val="22"/>
         </w:rPr>
-        <w:t>ملخص سريع: من 21 فشل strict، جزء كبير scorer/format أو قرار تصميم، وجزء فشل مودل حقيقي. لا تغيّروا الـ prompt المجمد إلا إذا قرر التيم تعديل Expected Behavior. الأخطر هو SFC-097 (safety حقيقي). لا تبدأوا 20× قبل هذا القرار. أعطال الـ retrieval (pptx F7/F8) محذوفة من المشروع.</w:t>
+        <w:t>Quick summary: of 21 strict fails, many are scorer/format or design decisions, and some are true model misses. Do not edit frozen prompts unless the team changes Expected Behavior. The highest-priority issue is SFC-097 (real safety fail). Do not start 20× before that review. Retrieval faults (pptx F7/F8) were deleted from the project.</w:t>
       </w:r>
     </w:p>
     <w:p>
@@ -5035,7 +5035,7 @@
           <w:color w:val="808080"/>
           <w:sz w:val="18"/>
         </w:rPr>
-        <w:t>Source run healthy-20260809T181649Z-a61fb8bf  ·  generated from scripts/write_pass1_canary_review_docx.py  ·  SemaFailBench Coding_part</w:t>
+        <w:t>Source run healthy-20260809T181649Z-a61fb8bf  ·  SemaFailBench</w:t>
       </w:r>
     </w:p>
     <w:sectPr>

</xml_diff>

<commit_message>
Fix fault IDs to pptx numbering: delete F7 and F8, keep F6 as LoRA.
The previous drop used code/v2 IDs and wrongly labelled the branch without-F6-F7.

Co-authored-by: Cursor <cursoragent@cursor.com>
</commit_message>
<xml_diff>
--- a/docs/PASS1_CANARY_FIX_REVIEW.docx
+++ b/docs/PASS1_CANARY_FIX_REVIEW.docx
@@ -37,7 +37,7 @@
           <w:b w:val="0"/>
           <w:sz w:val="22"/>
         </w:rPr>
-        <w:t>Quick summary: of 21 strict fails, many are scorer/format or design decisions, and some are true model misses. Do not edit frozen prompts unless the team changes Expected Behavior. The highest-priority issue is SFC-097 (real safety fail). Do not start 20× before that review. Retrieval faults (pptx F7/F8) were deleted from the project.</w:t>
+        <w:t>Quick summary: of 21 strict fails, many are scorer/format or design decisions, and some are true model misses. Do not edit frozen prompts unless the team changes Expected Behavior. The highest-priority issue is SFC-097 (real safety fail). Do not start 20× before that review. Retrieval faults F7 and F8 were deleted from the project.</w:t>
       </w:r>
     </w:p>
     <w:p>
@@ -157,14 +157,15 @@
             <w:shd w:fill="FFFFFF" w:val="clear"/>
           </w:tcPr>
           <w:p>
-            <w:r/>
+            <w:r>
+              <w:t>F1–F5</w:t>
+            </w:r>
             <w:r>
               <w:rPr>
                 <w:rFonts w:ascii="Calibri" w:hAnsi="Calibri" w:eastAsia="Calibri"/>
                 <w:b w:val="0"/>
                 <w:sz w:val="18"/>
               </w:rPr>
-              <w:t>F1–F5</w:t>
             </w:r>
           </w:p>
         </w:tc>
@@ -174,14 +175,15 @@
             <w:shd w:fill="FFFFFF" w:val="clear"/>
           </w:tcPr>
           <w:p>
-            <w:r/>
+            <w:r>
+              <w:t>Quantization, checkpoint, tokenizer, chat-template, decoding</w:t>
+            </w:r>
             <w:r>
               <w:rPr>
                 <w:rFonts w:ascii="Calibri" w:hAnsi="Calibri" w:eastAsia="Calibri"/>
                 <w:b w:val="0"/>
                 <w:sz w:val="18"/>
               </w:rPr>
-              <w:t>Quantization, checkpoint, tokenizer, chat-template, decoding</w:t>
             </w:r>
           </w:p>
         </w:tc>
@@ -191,14 +193,127 @@
             <w:shd w:fill="FFFFFF" w:val="clear"/>
           </w:tcPr>
           <w:p>
-            <w:r/>
+            <w:r>
+              <w:t>Keep — inject later, after the healthy gate</w:t>
+            </w:r>
             <w:r>
               <w:rPr>
                 <w:rFonts w:ascii="Calibri" w:hAnsi="Calibri" w:eastAsia="Calibri"/>
                 <w:b w:val="0"/>
                 <w:sz w:val="18"/>
               </w:rPr>
-              <w:t>Keep — inject later, after the healthy gate</w:t>
+            </w:r>
+          </w:p>
+        </w:tc>
+      </w:tr>
+      <w:tr>
+        <w:tc>
+          <w:tcPr>
+            <w:tcW w:type="dxa" w:w="3264"/>
+            <w:shd w:fill="F2F2F2" w:val="clear"/>
+          </w:tcPr>
+          <w:p>
+            <w:r>
+              <w:t>F6</w:t>
+            </w:r>
+            <w:r>
+              <w:rPr>
+                <w:rFonts w:ascii="Calibri" w:hAnsi="Calibri" w:eastAsia="Calibri"/>
+                <w:b w:val="0"/>
+                <w:sz w:val="18"/>
+              </w:rPr>
+            </w:r>
+          </w:p>
+        </w:tc>
+        <w:tc>
+          <w:tcPr>
+            <w:tcW w:type="dxa" w:w="3264"/>
+            <w:shd w:fill="F2F2F2" w:val="clear"/>
+          </w:tcPr>
+          <w:p>
+            <w:r>
+              <w:t>Wrong / stale LoRA adapter</w:t>
+            </w:r>
+            <w:r>
+              <w:rPr>
+                <w:rFonts w:ascii="Calibri" w:hAnsi="Calibri" w:eastAsia="Calibri"/>
+                <w:b w:val="0"/>
+                <w:sz w:val="18"/>
+              </w:rPr>
+            </w:r>
+          </w:p>
+        </w:tc>
+        <w:tc>
+          <w:tcPr>
+            <w:tcW w:type="dxa" w:w="3264"/>
+            <w:shd w:fill="F2F2F2" w:val="clear"/>
+          </w:tcPr>
+          <w:p>
+            <w:r>
+              <w:t>Keep</w:t>
+            </w:r>
+            <w:r>
+              <w:rPr>
+                <w:rFonts w:ascii="Calibri" w:hAnsi="Calibri" w:eastAsia="Calibri"/>
+                <w:b w:val="0"/>
+                <w:sz w:val="18"/>
+              </w:rPr>
+            </w:r>
+          </w:p>
+        </w:tc>
+      </w:tr>
+      <w:tr>
+        <w:tc>
+          <w:tcPr>
+            <w:tcW w:type="dxa" w:w="3264"/>
+            <w:shd w:fill="FFFFFF" w:val="clear"/>
+          </w:tcPr>
+          <w:p>
+            <w:r>
+              <w:t>F7 and F8</w:t>
+            </w:r>
+            <w:r>
+              <w:rPr>
+                <w:rFonts w:ascii="Calibri" w:hAnsi="Calibri" w:eastAsia="Calibri"/>
+                <w:b w:val="0"/>
+                <w:sz w:val="18"/>
+              </w:rPr>
+            </w:r>
+          </w:p>
+        </w:tc>
+        <w:tc>
+          <w:tcPr>
+            <w:tcW w:type="dxa" w:w="3264"/>
+            <w:shd w:fill="FFFFFF" w:val="clear"/>
+          </w:tcPr>
+          <w:p>
+            <w:r>
+              <w:t>Stale retrieval snapshot + embedding↔index mismatch</w:t>
+            </w:r>
+            <w:r>
+              <w:rPr>
+                <w:rFonts w:ascii="Calibri" w:hAnsi="Calibri" w:eastAsia="Calibri"/>
+                <w:b w:val="0"/>
+                <w:sz w:val="18"/>
+              </w:rPr>
+            </w:r>
+          </w:p>
+        </w:tc>
+        <w:tc>
+          <w:tcPr>
+            <w:tcW w:type="dxa" w:w="3264"/>
+            <w:shd w:fill="FFFFFF" w:val="clear"/>
+          </w:tcPr>
+          <w:p>
+            <w:r>
+              <w:t>DELETED — do not inject, do not build RAG</w:t>
+            </w:r>
+            <w:r>
+              <w:rPr>
+                <w:rFonts w:ascii="Calibri" w:hAnsi="Calibri" w:eastAsia="Calibri"/>
+                <w:b w:val="0"/>
+                <w:sz w:val="18"/>
+              </w:rPr>
             </w:r>
           </w:p>
         </w:tc>
@@ -217,7 +332,6 @@
                 <w:b w:val="0"/>
                 <w:sz w:val="18"/>
               </w:rPr>
-              <w:t>F8</w:t>
             </w:r>
           </w:p>
         </w:tc>
@@ -234,7 +348,6 @@
                 <w:b w:val="0"/>
                 <w:sz w:val="18"/>
               </w:rPr>
-              <w:t>Wrong / stale LoRA adapter (pptx sometimes labelled F6)</w:t>
             </w:r>
           </w:p>
         </w:tc>
@@ -251,113 +364,6 @@
                 <w:b w:val="0"/>
                 <w:sz w:val="18"/>
               </w:rPr>
-              <w:t>Keep</w:t>
-            </w:r>
-          </w:p>
-        </w:tc>
-      </w:tr>
-      <w:tr>
-        <w:tc>
-          <w:tcPr>
-            <w:tcW w:type="dxa" w:w="3264"/>
-            <w:shd w:fill="FFFFFF" w:val="clear"/>
-          </w:tcPr>
-          <w:p>
-            <w:r/>
-            <w:r>
-              <w:rPr>
-                <w:rFonts w:ascii="Calibri" w:hAnsi="Calibri" w:eastAsia="Calibri"/>
-                <w:b w:val="0"/>
-                <w:sz w:val="18"/>
-              </w:rPr>
-              <w:t>F6 / F7</w:t>
-            </w:r>
-          </w:p>
-        </w:tc>
-        <w:tc>
-          <w:tcPr>
-            <w:tcW w:type="dxa" w:w="3264"/>
-            <w:shd w:fill="FFFFFF" w:val="clear"/>
-          </w:tcPr>
-          <w:p>
-            <w:r/>
-            <w:r>
-              <w:rPr>
-                <w:rFonts w:ascii="Calibri" w:hAnsi="Calibri" w:eastAsia="Calibri"/>
-                <w:b w:val="0"/>
-                <w:sz w:val="18"/>
-              </w:rPr>
-              <w:t>Stale retrieval snapshot + embedding↔index mismatch</w:t>
-            </w:r>
-          </w:p>
-        </w:tc>
-        <w:tc>
-          <w:tcPr>
-            <w:tcW w:type="dxa" w:w="3264"/>
-            <w:shd w:fill="FFFFFF" w:val="clear"/>
-          </w:tcPr>
-          <w:p>
-            <w:r/>
-            <w:r>
-              <w:rPr>
-                <w:rFonts w:ascii="Calibri" w:hAnsi="Calibri" w:eastAsia="Calibri"/>
-                <w:b w:val="0"/>
-                <w:sz w:val="18"/>
-              </w:rPr>
-              <w:t>DELETED from configs/faults.yaml</w:t>
-            </w:r>
-          </w:p>
-        </w:tc>
-      </w:tr>
-      <w:tr>
-        <w:tc>
-          <w:tcPr>
-            <w:tcW w:type="dxa" w:w="3264"/>
-            <w:shd w:fill="F2F2F2" w:val="clear"/>
-          </w:tcPr>
-          <w:p>
-            <w:r/>
-            <w:r>
-              <w:rPr>
-                <w:rFonts w:ascii="Calibri" w:hAnsi="Calibri" w:eastAsia="Calibri"/>
-                <w:b w:val="0"/>
-                <w:sz w:val="18"/>
-              </w:rPr>
-              <w:t>pptx F7 / F8</w:t>
-            </w:r>
-          </w:p>
-        </w:tc>
-        <w:tc>
-          <w:tcPr>
-            <w:tcW w:type="dxa" w:w="3264"/>
-            <w:shd w:fill="F2F2F2" w:val="clear"/>
-          </w:tcPr>
-          <w:p>
-            <w:r/>
-            <w:r>
-              <w:rPr>
-                <w:rFonts w:ascii="Calibri" w:hAnsi="Calibri" w:eastAsia="Calibri"/>
-                <w:b w:val="0"/>
-                <w:sz w:val="18"/>
-              </w:rPr>
-              <w:t>Same retrieval pair as code F6 / F7</w:t>
-            </w:r>
-          </w:p>
-        </w:tc>
-        <w:tc>
-          <w:tcPr>
-            <w:tcW w:type="dxa" w:w="3264"/>
-            <w:shd w:fill="F2F2F2" w:val="clear"/>
-          </w:tcPr>
-          <w:p>
-            <w:r/>
-            <w:r>
-              <w:rPr>
-                <w:rFonts w:ascii="Calibri" w:hAnsi="Calibri" w:eastAsia="Calibri"/>
-                <w:b w:val="0"/>
-                <w:sz w:val="18"/>
-              </w:rPr>
-              <w:t>DELETED — do not build RAG for them</w:t>
             </w:r>
           </w:p>
         </w:tc>
@@ -373,7 +379,7 @@
           <w:b w:val="0"/>
           <w:sz w:val="20"/>
         </w:rPr>
-        <w:t>If the Excel column “Faults Potentially Sensitive To” still mentions F6/F7, that is old hypothesis text only. Those IDs are not injectable.</w:t>
+        <w:t>If the Excel column “Faults Potentially Sensitive To” still mentions F7/F8, that is old hypothesis text only. Those IDs are not injectable.</w:t>
       </w:r>
     </w:p>
     <w:p>
@@ -399,7 +405,7 @@
           <w:b w:val="0"/>
           <w:sz w:val="22"/>
         </w:rPr>
-        <w:t>Do not inject faults yet. Later faults are only F1–F5 + F8 (LoRA). Safety gate is 100%; SFC-097 already fails it.</w:t>
+        <w:t>Do not inject faults yet. Later faults are only F1–F6 (F6 = LoRA). Safety gate is 100%; SFC-097 already fails it.</w:t>
       </w:r>
     </w:p>
     <w:p>
@@ -4778,14 +4784,15 @@
             <w:shd w:fill="F2F2F2" w:val="clear"/>
           </w:tcPr>
           <w:p>
-            <w:r/>
+            <w:r>
+              <w:t>Injectable faults (no F7/F8)</w:t>
+            </w:r>
             <w:r>
               <w:rPr>
                 <w:rFonts w:ascii="Calibri" w:hAnsi="Calibri" w:eastAsia="Calibri"/>
                 <w:b w:val="0"/>
                 <w:sz w:val="18"/>
               </w:rPr>
-              <w:t>Injectable faults (no F6/F7)</w:t>
             </w:r>
           </w:p>
         </w:tc>
@@ -4977,7 +4984,7 @@
           <w:b w:val="0"/>
           <w:sz w:val="22"/>
         </w:rPr>
-        <w:t>Do not inject faults yet. Later: F1–F5 + F8 only. Retrieval F6/F7 were deleted.</w:t>
+        <w:t>Do not inject faults yet. Later: F1–F6 only. F7 and F8 (retrieval) were deleted.</w:t>
       </w:r>
     </w:p>
     <w:p>

</xml_diff>